<commit_message>
Remoção de pastas do web-data-viz e modificações finais do projeto
</commit_message>
<xml_diff>
--- a/Documentacao/Projeto Individual.docx
+++ b/Documentacao/Projeto Individual.docx
@@ -356,6 +356,26 @@
           <w:rFonts w:ascii="Times New Roman" w:hAnsi="Times New Roman" w:cs="Times New Roman"/>
         </w:rPr>
         <w:t>, em que estará armazenado as informações dentro do banco de dados.</w:t>
+      </w:r>
+    </w:p>
+    <w:p>
+      <w:pPr>
+        <w:jc w:val="both"/>
+        <w:rPr>
+          <w:rFonts w:ascii="Times New Roman" w:hAnsi="Times New Roman" w:cs="Times New Roman"/>
+        </w:rPr>
+      </w:pPr>
+      <w:r>
+        <w:rPr>
+          <w:rFonts w:ascii="Times New Roman" w:hAnsi="Times New Roman" w:cs="Times New Roman"/>
+        </w:rPr>
+        <w:t>O projeto também está relacionado com a ODS 4 – Educação de Qualidade, proposta pela Organização das Nações Unidas (ONU)</w:t>
+      </w:r>
+      <w:r>
+        <w:rPr>
+          <w:rFonts w:ascii="Times New Roman" w:hAnsi="Times New Roman" w:cs="Times New Roman"/>
+        </w:rPr>
+        <w:t>, que promove aprendizado sobre a história do sertanejo e valorizando a cultura brasileira, por meio de recursos tecnológicos.</w:t>
       </w:r>
     </w:p>
     <w:p>
@@ -653,7 +673,14 @@
         <w:rPr>
           <w:rFonts w:ascii="Times New Roman" w:hAnsi="Times New Roman" w:cs="Times New Roman"/>
         </w:rPr>
-        <w:t xml:space="preserve">O sistema contará com um banco de dados para armazenamento das informações dos usuários cadastrados, garantindo o gerenciamento de dados como nome, </w:t>
+        <w:t xml:space="preserve">O </w:t>
+      </w:r>
+      <w:r>
+        <w:rPr>
+          <w:rFonts w:ascii="Times New Roman" w:hAnsi="Times New Roman" w:cs="Times New Roman"/>
+        </w:rPr>
+        <w:lastRenderedPageBreak/>
+        <w:t xml:space="preserve">sistema contará com um banco de dados para armazenamento das informações dos usuários cadastrados, garantindo o gerenciamento de dados como nome, </w:t>
       </w:r>
       <w:r>
         <w:rPr>
@@ -665,13 +692,7 @@
         <w:rPr>
           <w:rFonts w:ascii="Times New Roman" w:hAnsi="Times New Roman" w:cs="Times New Roman"/>
         </w:rPr>
-        <w:t>e-mail</w:t>
-      </w:r>
-      <w:r>
-        <w:rPr>
-          <w:rFonts w:ascii="Times New Roman" w:hAnsi="Times New Roman" w:cs="Times New Roman"/>
-        </w:rPr>
-        <w:t xml:space="preserve"> e senha.</w:t>
+        <w:t>e-mail e senha.</w:t>
       </w:r>
     </w:p>
     <w:p>
@@ -704,7 +725,6 @@
           <w:b/>
           <w:bCs/>
         </w:rPr>
-        <w:lastRenderedPageBreak/>
         <w:t xml:space="preserve"> Resultados esperados </w:t>
       </w:r>
     </w:p>
@@ -807,19 +827,7 @@
         <w:rPr>
           <w:rFonts w:ascii="Times New Roman" w:hAnsi="Times New Roman" w:cs="Times New Roman"/>
         </w:rPr>
-        <w:t xml:space="preserve">A API utilizada </w:t>
-      </w:r>
-      <w:r>
-        <w:rPr>
-          <w:rFonts w:ascii="Times New Roman" w:hAnsi="Times New Roman" w:cs="Times New Roman"/>
-        </w:rPr>
-        <w:t>funcionará</w:t>
-      </w:r>
-      <w:r>
-        <w:rPr>
-          <w:rFonts w:ascii="Times New Roman" w:hAnsi="Times New Roman" w:cs="Times New Roman"/>
-        </w:rPr>
-        <w:t xml:space="preserve"> corretamente durante o desenvolvimento</w:t>
+        <w:t>A API utilizada funcionará corretamente durante o desenvolvimento</w:t>
       </w:r>
     </w:p>
     <w:p>
@@ -1811,6 +1819,7 @@
               <w:rPr>
                 <w:rFonts w:ascii="Times New Roman" w:hAnsi="Times New Roman" w:cs="Times New Roman"/>
               </w:rPr>
+              <w:lastRenderedPageBreak/>
               <w:t>Banco de Dados</w:t>
             </w:r>
           </w:p>
@@ -1919,7 +1928,6 @@
           <w:b/>
           <w:bCs/>
         </w:rPr>
-        <w:lastRenderedPageBreak/>
         <w:t>Requisitos Não Funcionais</w:t>
       </w:r>
     </w:p>
@@ -2606,16 +2614,8 @@
               <w:rPr>
                 <w:rFonts w:ascii="Times New Roman" w:hAnsi="Times New Roman" w:cs="Times New Roman"/>
               </w:rPr>
-              <w:t xml:space="preserve"> documentação + </w:t>
-            </w:r>
-            <w:proofErr w:type="spellStart"/>
-            <w:r>
-              <w:rPr>
-                <w:rFonts w:ascii="Times New Roman" w:hAnsi="Times New Roman" w:cs="Times New Roman"/>
-              </w:rPr>
-              <w:t>Git</w:t>
-            </w:r>
-            <w:proofErr w:type="spellEnd"/>
+              <w:t xml:space="preserve"> documentação + Git</w:t>
+            </w:r>
           </w:p>
         </w:tc>
         <w:tc>
@@ -3143,20 +3143,8 @@
                 <w:lang w:eastAsia="pt-BR"/>
                 <w14:ligatures w14:val="none"/>
               </w:rPr>
-              <w:t>Desenvolvedor Back-</w:t>
-            </w:r>
-            <w:proofErr w:type="spellStart"/>
-            <w:r>
-              <w:rPr>
-                <w:rFonts w:ascii="Arial" w:eastAsia="Times New Roman" w:hAnsi="Arial" w:cs="Arial"/>
-                <w:color w:val="000000"/>
-                <w:kern w:val="0"/>
-                <w:lang w:eastAsia="pt-BR"/>
-                <w14:ligatures w14:val="none"/>
-              </w:rPr>
-              <w:t>End</w:t>
-            </w:r>
-            <w:proofErr w:type="spellEnd"/>
+              <w:t>Desenvolvedor Back-End</w:t>
+            </w:r>
           </w:p>
         </w:tc>
         <w:tc>
@@ -3253,20 +3241,8 @@
                 <w:lang w:eastAsia="pt-BR"/>
                 <w14:ligatures w14:val="none"/>
               </w:rPr>
-              <w:t>Desenvolvedor Front-</w:t>
-            </w:r>
-            <w:proofErr w:type="spellStart"/>
-            <w:r>
-              <w:rPr>
-                <w:rFonts w:ascii="Arial" w:eastAsia="Times New Roman" w:hAnsi="Arial" w:cs="Arial"/>
-                <w:color w:val="000000"/>
-                <w:kern w:val="0"/>
-                <w:lang w:eastAsia="pt-BR"/>
-                <w14:ligatures w14:val="none"/>
-              </w:rPr>
-              <w:t>End</w:t>
-            </w:r>
-            <w:proofErr w:type="spellEnd"/>
+              <w:t>Desenvolvedor Front-End</w:t>
+            </w:r>
           </w:p>
         </w:tc>
         <w:tc>
@@ -3362,6 +3338,7 @@
                 <w:lang w:eastAsia="pt-BR"/>
                 <w14:ligatures w14:val="none"/>
               </w:rPr>
+              <w:lastRenderedPageBreak/>
               <w:t>Gestor do Projeto</w:t>
             </w:r>
           </w:p>
@@ -3775,7 +3752,6 @@
           <w:b/>
           <w:bCs/>
         </w:rPr>
-        <w:lastRenderedPageBreak/>
         <w:t>Partes interessadas (stakeholders)</w:t>
       </w:r>
     </w:p>
@@ -4026,22 +4002,8 @@
                 <w:lang w:eastAsia="pt-BR"/>
                 <w14:ligatures w14:val="none"/>
               </w:rPr>
-              <w:t>Desenvolvedor Back-</w:t>
-            </w:r>
-            <w:proofErr w:type="spellStart"/>
-            <w:r>
-              <w:rPr>
-                <w:rFonts w:ascii="Arial" w:eastAsia="Times New Roman" w:hAnsi="Arial" w:cs="Arial"/>
-                <w:b w:val="0"/>
-                <w:bCs w:val="0"/>
-                <w:color w:val="000000"/>
-                <w:kern w:val="0"/>
-                <w:lang w:eastAsia="pt-BR"/>
-                <w14:ligatures w14:val="none"/>
-              </w:rPr>
-              <w:t>End</w:t>
-            </w:r>
-            <w:proofErr w:type="spellEnd"/>
+              <w:t>Desenvolvedor Back-End</w:t>
+            </w:r>
           </w:p>
         </w:tc>
         <w:tc>
@@ -4144,22 +4106,8 @@
                 <w:lang w:eastAsia="pt-BR"/>
                 <w14:ligatures w14:val="none"/>
               </w:rPr>
-              <w:t>Desenvolvedor Front-</w:t>
-            </w:r>
-            <w:proofErr w:type="spellStart"/>
-            <w:r>
-              <w:rPr>
-                <w:rFonts w:ascii="Arial" w:eastAsia="Times New Roman" w:hAnsi="Arial" w:cs="Arial"/>
-                <w:b w:val="0"/>
-                <w:bCs w:val="0"/>
-                <w:color w:val="000000"/>
-                <w:kern w:val="0"/>
-                <w:lang w:eastAsia="pt-BR"/>
-                <w14:ligatures w14:val="none"/>
-              </w:rPr>
-              <w:t>End</w:t>
-            </w:r>
-            <w:proofErr w:type="spellEnd"/>
+              <w:t>Desenvolvedor Front-End</w:t>
+            </w:r>
           </w:p>
         </w:tc>
         <w:tc>
@@ -5469,11 +5417,13 @@
   <w:style w:type="character" w:default="1" w:styleId="Fontepargpadro">
     <w:name w:val="Default Paragraph Font"/>
     <w:uiPriority w:val="1"/>
+    <w:semiHidden/>
     <w:unhideWhenUsed/>
   </w:style>
   <w:style w:type="table" w:default="1" w:styleId="Tabelanormal">
     <w:name w:val="Normal Table"/>
     <w:uiPriority w:val="99"/>
+    <w:semiHidden/>
     <w:unhideWhenUsed/>
     <w:tblPr>
       <w:tblInd w:w="0" w:type="dxa"/>
@@ -6526,6 +6476,23 @@
 </file>
 
 <file path=customXml/item1.xml><?xml version="1.0" encoding="utf-8"?>
+<p:properties xmlns:p="http://schemas.microsoft.com/office/2006/metadata/properties" xmlns:xsi="http://www.w3.org/2001/XMLSchema-instance" xmlns:pc="http://schemas.microsoft.com/office/infopath/2007/PartnerControls">
+  <documentManagement>
+    <_activity xmlns="46a962bb-4130-4e9c-a314-67ba0c15fe95" xsi:nil="true"/>
+  </documentManagement>
+</p:properties>
+</file>
+
+<file path=customXml/item2.xml><?xml version="1.0" encoding="utf-8"?>
+<?mso-contentType ?>
+<FormTemplates xmlns="http://schemas.microsoft.com/sharepoint/v3/contenttype/forms">
+  <Display>DocumentLibraryForm</Display>
+  <Edit>DocumentLibraryForm</Edit>
+  <New>DocumentLibraryForm</New>
+</FormTemplates>
+</file>
+
+<file path=customXml/item3.xml><?xml version="1.0" encoding="utf-8"?>
 <ct:contentTypeSchema xmlns:ct="http://schemas.microsoft.com/office/2006/metadata/contentType" xmlns:ma="http://schemas.microsoft.com/office/2006/metadata/properties/metaAttributes" ct:_="" ma:_="" ma:contentTypeName="Document" ma:contentTypeID="0x010100985B594598064C46AA4BF45D07A1A3FC" ma:contentTypeVersion="9" ma:contentTypeDescription="Create a new document." ma:contentTypeScope="" ma:versionID="29df294d20b9e58580b78203459876e7">
   <xsd:schema xmlns:xsd="http://www.w3.org/2001/XMLSchema" xmlns:xs="http://www.w3.org/2001/XMLSchema" xmlns:p="http://schemas.microsoft.com/office/2006/metadata/properties" xmlns:ns3="46a962bb-4130-4e9c-a314-67ba0c15fe95" targetNamespace="http://schemas.microsoft.com/office/2006/metadata/properties" ma:root="true" ma:fieldsID="c050c314bb271804e191dde0df9d4d62" ns3:_="">
     <xsd:import namespace="46a962bb-4130-4e9c-a314-67ba0c15fe95"/>
@@ -6701,24 +6668,25 @@
 </ct:contentTypeSchema>
 </file>
 
-<file path=customXml/item2.xml><?xml version="1.0" encoding="utf-8"?>
-<?mso-contentType ?>
-<FormTemplates xmlns="http://schemas.microsoft.com/sharepoint/v3/contenttype/forms">
-  <Display>DocumentLibraryForm</Display>
-  <Edit>DocumentLibraryForm</Edit>
-  <New>DocumentLibraryForm</New>
-</FormTemplates>
+<file path=customXml/itemProps1.xml><?xml version="1.0" encoding="utf-8"?>
+<ds:datastoreItem xmlns:ds="http://schemas.openxmlformats.org/officeDocument/2006/customXml" ds:itemID="{C37B7F6E-FC0F-4810-A258-7072173D33F7}">
+  <ds:schemaRefs>
+    <ds:schemaRef ds:uri="http://schemas.microsoft.com/office/2006/metadata/properties"/>
+    <ds:schemaRef ds:uri="http://schemas.microsoft.com/office/infopath/2007/PartnerControls"/>
+    <ds:schemaRef ds:uri="46a962bb-4130-4e9c-a314-67ba0c15fe95"/>
+  </ds:schemaRefs>
+</ds:datastoreItem>
 </file>
 
-<file path=customXml/item3.xml><?xml version="1.0" encoding="utf-8"?>
-<p:properties xmlns:p="http://schemas.microsoft.com/office/2006/metadata/properties" xmlns:xsi="http://www.w3.org/2001/XMLSchema-instance" xmlns:pc="http://schemas.microsoft.com/office/infopath/2007/PartnerControls">
-  <documentManagement>
-    <_activity xmlns="46a962bb-4130-4e9c-a314-67ba0c15fe95" xsi:nil="true"/>
-  </documentManagement>
-</p:properties>
+<file path=customXml/itemProps2.xml><?xml version="1.0" encoding="utf-8"?>
+<ds:datastoreItem xmlns:ds="http://schemas.openxmlformats.org/officeDocument/2006/customXml" ds:itemID="{9BFBC117-CD12-4BAA-BF21-982D3FD3BFAA}">
+  <ds:schemaRefs>
+    <ds:schemaRef ds:uri="http://schemas.microsoft.com/sharepoint/v3/contenttype/forms"/>
+  </ds:schemaRefs>
+</ds:datastoreItem>
 </file>
 
-<file path=customXml/itemProps1.xml><?xml version="1.0" encoding="utf-8"?>
+<file path=customXml/itemProps3.xml><?xml version="1.0" encoding="utf-8"?>
 <ds:datastoreItem xmlns:ds="http://schemas.openxmlformats.org/officeDocument/2006/customXml" ds:itemID="{0AD3B55C-7044-41D4-AB13-A2E333C3F1B3}">
   <ds:schemaRefs>
     <ds:schemaRef ds:uri="http://schemas.microsoft.com/office/2006/metadata/contentType"/>
@@ -6734,22 +6702,4 @@
     <ds:schemaRef ds:uri="http://schemas.microsoft.com/internal/obd"/>
   </ds:schemaRefs>
 </ds:datastoreItem>
-</file>
-
-<file path=customXml/itemProps2.xml><?xml version="1.0" encoding="utf-8"?>
-<ds:datastoreItem xmlns:ds="http://schemas.openxmlformats.org/officeDocument/2006/customXml" ds:itemID="{9BFBC117-CD12-4BAA-BF21-982D3FD3BFAA}">
-  <ds:schemaRefs>
-    <ds:schemaRef ds:uri="http://schemas.microsoft.com/sharepoint/v3/contenttype/forms"/>
-  </ds:schemaRefs>
-</ds:datastoreItem>
-</file>
-
-<file path=customXml/itemProps3.xml><?xml version="1.0" encoding="utf-8"?>
-<ds:datastoreItem xmlns:ds="http://schemas.openxmlformats.org/officeDocument/2006/customXml" ds:itemID="{C37B7F6E-FC0F-4810-A258-7072173D33F7}">
-  <ds:schemaRefs>
-    <ds:schemaRef ds:uri="http://schemas.microsoft.com/office/2006/metadata/properties"/>
-    <ds:schemaRef ds:uri="http://schemas.microsoft.com/office/infopath/2007/PartnerControls"/>
-    <ds:schemaRef ds:uri="46a962bb-4130-4e9c-a314-67ba0c15fe95"/>
-  </ds:schemaRefs>
-</ds:datastoreItem>
 </file>
</xml_diff>